<commit_message>
Update EDO practice materials
</commit_message>
<xml_diff>
--- a/edo/задание 2/готовые документы/06_приказ_ООО_Яндекс_о_назначении_руководителя_практики.docx
+++ b/edo/задание 2/готовые документы/06_приказ_ООО_Яндекс_о_назначении_руководителя_практики.docx
@@ -121,7 +121,7 @@
           <w:b w:val="0"/>
           <w:sz w:val="24"/>
         </w:rPr>
-        <w:t>В целях организации прохождения производственной практики (технологической (проектно-технологической) практики) студенткой ННГУ им. Н.И. Лобачевского Токарева Алёна Сергеевна с 08.06.2026 по 05.07.2026</w:t>
+        <w:t>В целях организации прохождения производственной практики (технологической (проектно-технологической) практики) студенткой ННГУ им. Н.И. Лобачевского Токарева Алена Дмитриевна с 08.06.2026 по 05.07.2026</w:t>
       </w:r>
     </w:p>
     <w:p>
@@ -148,7 +148,7 @@
           <w:b w:val="0"/>
           <w:sz w:val="24"/>
         </w:rPr>
-        <w:t>1. Принять Токареву Алёну Сергеевну, студентку группы 3523Б3ПИ1, для прохождения практики в ООО "ЯНДЕКС" с 08.06.2026 по 05.07.2026.</w:t>
+        <w:t>1. Принять Токареву Алену Дмитриевну, студентку группы 3523Б3ПИ1, для прохождения практики в ООО "ЯНДЕКС" с 08.06.2026 по 05.07.2026.</w:t>
       </w:r>
     </w:p>
     <w:p>

</xml_diff>